<commit_message>
Add fields for scientific work links in submission form and database
</commit_message>
<xml_diff>
--- a/templates_surat/penyerahan_skripsi.docx
+++ b/templates_surat/penyerahan_skripsi.docx
@@ -356,23 +356,7 @@
           <w:sz w:val="24"/>
           <w:szCs w:val="24"/>
         </w:rPr>
-        <w:t>{{</w:t>
-      </w:r>
-      <w:proofErr w:type="spellStart"/>
-      <w:r>
-        <w:rPr>
-          <w:sz w:val="24"/>
-          <w:szCs w:val="24"/>
-        </w:rPr>
-        <w:t>npm</w:t>
-      </w:r>
-      <w:proofErr w:type="spellEnd"/>
-      <w:r>
-        <w:rPr>
-          <w:sz w:val="24"/>
-          <w:szCs w:val="24"/>
-        </w:rPr>
-        <w:t>}}</w:t>
+        <w:t>{{npm}}</w:t>
       </w:r>
     </w:p>
     <w:p>
@@ -567,23 +551,7 @@
           <w:sz w:val="24"/>
           <w:szCs w:val="24"/>
         </w:rPr>
-        <w:t>{{</w:t>
-      </w:r>
-      <w:proofErr w:type="spellStart"/>
-      <w:r>
-        <w:rPr>
-          <w:sz w:val="24"/>
-          <w:szCs w:val="24"/>
-        </w:rPr>
-        <w:t>judul</w:t>
-      </w:r>
-      <w:proofErr w:type="spellEnd"/>
-      <w:r>
-        <w:rPr>
-          <w:sz w:val="24"/>
-          <w:szCs w:val="24"/>
-        </w:rPr>
-        <w:t>}}</w:t>
+        <w:t>{{judul}}</w:t>
       </w:r>
     </w:p>
     <w:p>
@@ -621,23 +589,7 @@
           <w:sz w:val="24"/>
           <w:szCs w:val="24"/>
         </w:rPr>
-        <w:t>{{</w:t>
-      </w:r>
-      <w:proofErr w:type="spellStart"/>
-      <w:r>
-        <w:rPr>
-          <w:sz w:val="24"/>
-          <w:szCs w:val="24"/>
-        </w:rPr>
-        <w:t>tglsidang</w:t>
-      </w:r>
-      <w:proofErr w:type="spellEnd"/>
-      <w:r>
-        <w:rPr>
-          <w:sz w:val="24"/>
-          <w:szCs w:val="24"/>
-        </w:rPr>
-        <w:t>}}</w:t>
+        <w:t>{{tglsidang}}</w:t>
       </w:r>
     </w:p>
     <w:p>
@@ -902,7 +854,60 @@
           <w:szCs w:val="24"/>
           <w:lang w:val="pt-BR"/>
         </w:rPr>
-        <w:t>e. URL (link) Jurnal yang sudah dipublikasikan ke jurnal/Prosiding</w:t>
+        <w:t xml:space="preserve">    {{linkkaryailmiah}}</w:t>
+      </w:r>
+    </w:p>
+    <w:p>
+      <w:pPr>
+        <w:spacing w:line="276" w:lineRule="auto"/>
+        <w:ind w:left="720"/>
+        <w:jc w:val="both"/>
+        <w:rPr>
+          <w:bCs/>
+          <w:sz w:val="24"/>
+          <w:szCs w:val="24"/>
+          <w:lang w:val="pt-BR"/>
+        </w:rPr>
+      </w:pPr>
+      <w:r>
+        <w:rPr>
+          <w:bCs/>
+          <w:sz w:val="24"/>
+          <w:szCs w:val="24"/>
+          <w:lang w:val="pt-BR"/>
+        </w:rPr>
+        <w:t>d</w:t>
+      </w:r>
+      <w:r>
+        <w:rPr>
+          <w:bCs/>
+          <w:sz w:val="24"/>
+          <w:szCs w:val="24"/>
+          <w:lang w:val="pt-BR"/>
+        </w:rPr>
+        <w:t>. URL (link) Jurnal yang sudah dipublikasikan ke jurnal/Prosiding</w:t>
+      </w:r>
+    </w:p>
+    <w:p>
+      <w:pPr>
+        <w:spacing w:line="276" w:lineRule="auto"/>
+        <w:ind w:left="720"/>
+        <w:jc w:val="both"/>
+        <w:rPr>
+          <w:bCs/>
+          <w:sz w:val="24"/>
+          <w:szCs w:val="24"/>
+          <w:lang w:val="pt-BR"/>
+        </w:rPr>
+      </w:pPr>
+      <w:r>
+        <w:rPr>
+          <w:bCs/>
+          <w:sz w:val="24"/>
+          <w:szCs w:val="24"/>
+          <w:lang w:val="pt-BR"/>
+        </w:rPr>
+        <w:t xml:space="preserve">    {{linkjurnal}} </w:t>
       </w:r>
     </w:p>
     <w:p>
@@ -1372,23 +1377,13 @@
         </w:rPr>
         <w:tab/>
       </w:r>
-      <w:proofErr w:type="spellStart"/>
-      <w:r>
-        <w:rPr>
-          <w:sz w:val="24"/>
-          <w:szCs w:val="24"/>
-          <w:lang w:val="id-ID"/>
-        </w:rPr>
-        <w:t>apt</w:t>
-      </w:r>
-      <w:proofErr w:type="spellEnd"/>
-      <w:r>
-        <w:rPr>
-          <w:sz w:val="24"/>
-          <w:szCs w:val="24"/>
-          <w:lang w:val="id-ID"/>
-        </w:rPr>
-        <w:t xml:space="preserve">. </w:t>
+      <w:r>
+        <w:rPr>
+          <w:sz w:val="24"/>
+          <w:szCs w:val="24"/>
+          <w:lang w:val="id-ID"/>
+        </w:rPr>
+        <w:t xml:space="preserve">apt. </w:t>
       </w:r>
       <w:r>
         <w:rPr>
@@ -1403,40 +1398,8 @@
           <w:szCs w:val="24"/>
           <w:lang w:val="id-ID"/>
         </w:rPr>
-        <w:t xml:space="preserve">, </w:t>
-      </w:r>
-      <w:proofErr w:type="spellStart"/>
-      <w:proofErr w:type="gramStart"/>
-      <w:r>
-        <w:rPr>
-          <w:sz w:val="24"/>
-          <w:szCs w:val="24"/>
-          <w:lang w:val="id-ID"/>
-        </w:rPr>
-        <w:t>S.Farm</w:t>
-      </w:r>
-      <w:proofErr w:type="spellEnd"/>
-      <w:proofErr w:type="gramEnd"/>
-      <w:r>
-        <w:rPr>
-          <w:sz w:val="24"/>
-          <w:szCs w:val="24"/>
-          <w:lang w:val="id-ID"/>
-        </w:rPr>
-        <w:t xml:space="preserve">, </w:t>
-      </w:r>
-      <w:proofErr w:type="spellStart"/>
-      <w:proofErr w:type="gramStart"/>
-      <w:r>
-        <w:rPr>
-          <w:sz w:val="24"/>
-          <w:szCs w:val="24"/>
-          <w:lang w:val="id-ID"/>
-        </w:rPr>
-        <w:t>M.Si</w:t>
-      </w:r>
-      <w:proofErr w:type="spellEnd"/>
-      <w:proofErr w:type="gramEnd"/>
+        <w:t>, S.Farm, M.Si</w:t>
+      </w:r>
       <w:r>
         <w:rPr>
           <w:sz w:val="24"/>

</xml_diff>